<commit_message>
updated with real time example
</commit_message>
<xml_diff>
--- a/Day8_Concept.docx
+++ b/Day8_Concept.docx
@@ -4058,6 +4058,1236 @@
       </w:r>
     </w:p>
     <w:p/>
+    <w:p>
+      <w:pPr>
+        <w:rPr>
+          <w:b/>
+          <w:bCs/>
+        </w:rPr>
+      </w:pPr>
+      <w:r>
+        <w:rPr>
+          <w:b/>
+          <w:bCs/>
+        </w:rPr>
+        <w:t>BANKING ANALYTICS SYSTEM</w:t>
+      </w:r>
+    </w:p>
+    <w:p>
+      <w:r>
+        <w:t>Bank wants to analyze:</w:t>
+      </w:r>
+    </w:p>
+    <w:p>
+      <w:pPr>
+        <w:numPr>
+          <w:ilvl w:val="0"/>
+          <w:numId w:val="19"/>
+        </w:numPr>
+      </w:pPr>
+      <w:r>
+        <w:t xml:space="preserve">Customer transactions </w:t>
+      </w:r>
+    </w:p>
+    <w:p>
+      <w:pPr>
+        <w:numPr>
+          <w:ilvl w:val="0"/>
+          <w:numId w:val="19"/>
+        </w:numPr>
+      </w:pPr>
+      <w:r>
+        <w:t xml:space="preserve">Branch performance </w:t>
+      </w:r>
+    </w:p>
+    <w:p>
+      <w:pPr>
+        <w:numPr>
+          <w:ilvl w:val="0"/>
+          <w:numId w:val="19"/>
+        </w:numPr>
+      </w:pPr>
+      <w:r>
+        <w:t xml:space="preserve">Account types </w:t>
+      </w:r>
+    </w:p>
+    <w:p>
+      <w:pPr>
+        <w:numPr>
+          <w:ilvl w:val="0"/>
+          <w:numId w:val="19"/>
+        </w:numPr>
+      </w:pPr>
+      <w:r>
+        <w:t>Time-based trends</w:t>
+      </w:r>
+    </w:p>
+    <w:p>
+      <w:r>
+        <w:t>STAR SCHEMA (10 Tables)</w:t>
+      </w:r>
+    </w:p>
+    <w:p>
+      <w:r>
+        <w:t xml:space="preserve"> 1. FACT TABLE (Center)</w:t>
+      </w:r>
+    </w:p>
+    <w:p>
+      <w:r>
+        <w:t xml:space="preserve">CREATE TABLE </w:t>
+      </w:r>
+      <w:proofErr w:type="spellStart"/>
+      <w:r>
+        <w:t>fact_transactions</w:t>
+      </w:r>
+      <w:proofErr w:type="spellEnd"/>
+      <w:r>
+        <w:t xml:space="preserve"> (</w:t>
+      </w:r>
+    </w:p>
+    <w:p>
+      <w:r>
+        <w:t xml:space="preserve">    </w:t>
+      </w:r>
+      <w:proofErr w:type="spellStart"/>
+      <w:r>
+        <w:t>transaction_id</w:t>
+      </w:r>
+      <w:proofErr w:type="spellEnd"/>
+      <w:r>
+        <w:t xml:space="preserve"> INT PRIMARY KEY,</w:t>
+      </w:r>
+    </w:p>
+    <w:p>
+      <w:r>
+        <w:lastRenderedPageBreak/>
+        <w:t xml:space="preserve">    </w:t>
+      </w:r>
+      <w:proofErr w:type="spellStart"/>
+      <w:r>
+        <w:t>customer_id</w:t>
+      </w:r>
+      <w:proofErr w:type="spellEnd"/>
+      <w:r>
+        <w:t xml:space="preserve"> INT,</w:t>
+      </w:r>
+    </w:p>
+    <w:p>
+      <w:r>
+        <w:t xml:space="preserve">    </w:t>
+      </w:r>
+      <w:proofErr w:type="spellStart"/>
+      <w:r>
+        <w:t>account_id</w:t>
+      </w:r>
+      <w:proofErr w:type="spellEnd"/>
+      <w:r>
+        <w:t xml:space="preserve"> INT,</w:t>
+      </w:r>
+    </w:p>
+    <w:p>
+      <w:r>
+        <w:t xml:space="preserve">    </w:t>
+      </w:r>
+      <w:proofErr w:type="spellStart"/>
+      <w:r>
+        <w:t>branch_id</w:t>
+      </w:r>
+      <w:proofErr w:type="spellEnd"/>
+      <w:r>
+        <w:t xml:space="preserve"> INT,</w:t>
+      </w:r>
+    </w:p>
+    <w:p>
+      <w:r>
+        <w:t xml:space="preserve">    </w:t>
+      </w:r>
+      <w:proofErr w:type="spellStart"/>
+      <w:r>
+        <w:t>date_id</w:t>
+      </w:r>
+      <w:proofErr w:type="spellEnd"/>
+      <w:r>
+        <w:t xml:space="preserve"> INT,</w:t>
+      </w:r>
+    </w:p>
+    <w:p>
+      <w:r>
+        <w:t xml:space="preserve">    </w:t>
+      </w:r>
+      <w:proofErr w:type="spellStart"/>
+      <w:r>
+        <w:t>transaction_type_id</w:t>
+      </w:r>
+      <w:proofErr w:type="spellEnd"/>
+      <w:r>
+        <w:t xml:space="preserve"> INT,</w:t>
+      </w:r>
+    </w:p>
+    <w:p>
+      <w:r>
+        <w:t xml:space="preserve">    amount DECIMAL(10,2)</w:t>
+      </w:r>
+    </w:p>
+    <w:p>
+      <w:r>
+        <w:t>);</w:t>
+      </w:r>
+    </w:p>
+    <w:p>
+      <w:r>
+        <w:t xml:space="preserve"> 2. DIMENSION TABLES (Denormalized)</w:t>
+      </w:r>
+    </w:p>
+    <w:p>
+      <w:r>
+        <w:t xml:space="preserve"> Customer</w:t>
+      </w:r>
+    </w:p>
+    <w:p>
+      <w:r>
+        <w:t xml:space="preserve">CREATE TABLE </w:t>
+      </w:r>
+      <w:proofErr w:type="spellStart"/>
+      <w:r>
+        <w:t>dim_customer</w:t>
+      </w:r>
+      <w:proofErr w:type="spellEnd"/>
+      <w:r>
+        <w:t xml:space="preserve"> (</w:t>
+      </w:r>
+    </w:p>
+    <w:p>
+      <w:r>
+        <w:t xml:space="preserve">    </w:t>
+      </w:r>
+      <w:proofErr w:type="spellStart"/>
+      <w:r>
+        <w:t>customer_id</w:t>
+      </w:r>
+      <w:proofErr w:type="spellEnd"/>
+      <w:r>
+        <w:t xml:space="preserve"> INT PRIMARY KEY,</w:t>
+      </w:r>
+    </w:p>
+    <w:p>
+      <w:r>
+        <w:t xml:space="preserve">    </w:t>
+      </w:r>
+      <w:proofErr w:type="spellStart"/>
+      <w:r>
+        <w:t>customer_name</w:t>
+      </w:r>
+      <w:proofErr w:type="spellEnd"/>
+      <w:r>
+        <w:t xml:space="preserve"> VARCHAR(100),</w:t>
+      </w:r>
+    </w:p>
+    <w:p>
+      <w:r>
+        <w:t xml:space="preserve">    city VARCHAR(50),</w:t>
+      </w:r>
+    </w:p>
+    <w:p>
+      <w:r>
+        <w:t xml:space="preserve">    state VARCHAR(50),</w:t>
+      </w:r>
+    </w:p>
+    <w:p>
+      <w:r>
+        <w:t xml:space="preserve">    country VARCHAR(50)</w:t>
+      </w:r>
+    </w:p>
+    <w:p>
+      <w:r>
+        <w:t>);</w:t>
+      </w:r>
+    </w:p>
+    <w:p>
+      <w:r>
+        <w:t xml:space="preserve"> Account</w:t>
+      </w:r>
+    </w:p>
+    <w:p>
+      <w:r>
+        <w:t xml:space="preserve">CREATE TABLE </w:t>
+      </w:r>
+      <w:proofErr w:type="spellStart"/>
+      <w:r>
+        <w:t>dim_account</w:t>
+      </w:r>
+      <w:proofErr w:type="spellEnd"/>
+      <w:r>
+        <w:t xml:space="preserve"> (</w:t>
+      </w:r>
+    </w:p>
+    <w:p>
+      <w:r>
+        <w:t xml:space="preserve">    </w:t>
+      </w:r>
+      <w:proofErr w:type="spellStart"/>
+      <w:r>
+        <w:t>account_id</w:t>
+      </w:r>
+      <w:proofErr w:type="spellEnd"/>
+      <w:r>
+        <w:t xml:space="preserve"> INT PRIMARY KEY,</w:t>
+      </w:r>
+    </w:p>
+    <w:p>
+      <w:r>
+        <w:t xml:space="preserve">    </w:t>
+      </w:r>
+      <w:proofErr w:type="spellStart"/>
+      <w:r>
+        <w:t>account_type</w:t>
+      </w:r>
+      <w:proofErr w:type="spellEnd"/>
+      <w:r>
+        <w:t xml:space="preserve"> VARCHAR(50),</w:t>
+      </w:r>
+    </w:p>
+    <w:p>
+      <w:r>
+        <w:t xml:space="preserve">    </w:t>
+      </w:r>
+      <w:proofErr w:type="spellStart"/>
+      <w:r>
+        <w:t>account_status</w:t>
+      </w:r>
+      <w:proofErr w:type="spellEnd"/>
+      <w:r>
+        <w:t xml:space="preserve"> VARCHAR(20)</w:t>
+      </w:r>
+    </w:p>
+    <w:p>
+      <w:r>
+        <w:t>);</w:t>
+      </w:r>
+    </w:p>
+    <w:p>
+      <w:r>
+        <w:t xml:space="preserve"> Branch</w:t>
+      </w:r>
+    </w:p>
+    <w:p>
+      <w:r>
+        <w:t xml:space="preserve">CREATE TABLE </w:t>
+      </w:r>
+      <w:proofErr w:type="spellStart"/>
+      <w:r>
+        <w:t>dim_branch</w:t>
+      </w:r>
+      <w:proofErr w:type="spellEnd"/>
+      <w:r>
+        <w:t xml:space="preserve"> (</w:t>
+      </w:r>
+    </w:p>
+    <w:p>
+      <w:r>
+        <w:t xml:space="preserve">    </w:t>
+      </w:r>
+      <w:proofErr w:type="spellStart"/>
+      <w:r>
+        <w:t>branch_id</w:t>
+      </w:r>
+      <w:proofErr w:type="spellEnd"/>
+      <w:r>
+        <w:t xml:space="preserve"> INT PRIMARY KEY,</w:t>
+      </w:r>
+    </w:p>
+    <w:p>
+      <w:r>
+        <w:t xml:space="preserve">    </w:t>
+      </w:r>
+      <w:proofErr w:type="spellStart"/>
+      <w:r>
+        <w:t>branch_name</w:t>
+      </w:r>
+      <w:proofErr w:type="spellEnd"/>
+      <w:r>
+        <w:t xml:space="preserve"> VARCHAR(100),</w:t>
+      </w:r>
+    </w:p>
+    <w:p>
+      <w:r>
+        <w:lastRenderedPageBreak/>
+        <w:t xml:space="preserve">    city VARCHAR(50),</w:t>
+      </w:r>
+    </w:p>
+    <w:p>
+      <w:r>
+        <w:t xml:space="preserve">    state VARCHAR(50)</w:t>
+      </w:r>
+    </w:p>
+    <w:p>
+      <w:r>
+        <w:t>);</w:t>
+      </w:r>
+    </w:p>
+    <w:p>
+      <w:r>
+        <w:t xml:space="preserve"> Date</w:t>
+      </w:r>
+    </w:p>
+    <w:p>
+      <w:r>
+        <w:t xml:space="preserve">CREATE TABLE </w:t>
+      </w:r>
+      <w:proofErr w:type="spellStart"/>
+      <w:r>
+        <w:t>dim_date</w:t>
+      </w:r>
+      <w:proofErr w:type="spellEnd"/>
+      <w:r>
+        <w:t xml:space="preserve"> (</w:t>
+      </w:r>
+    </w:p>
+    <w:p>
+      <w:r>
+        <w:t xml:space="preserve">    </w:t>
+      </w:r>
+      <w:proofErr w:type="spellStart"/>
+      <w:r>
+        <w:t>date_id</w:t>
+      </w:r>
+      <w:proofErr w:type="spellEnd"/>
+      <w:r>
+        <w:t xml:space="preserve"> INT PRIMARY KEY,</w:t>
+      </w:r>
+    </w:p>
+    <w:p>
+      <w:r>
+        <w:t xml:space="preserve">    </w:t>
+      </w:r>
+      <w:proofErr w:type="spellStart"/>
+      <w:r>
+        <w:t>full_date</w:t>
+      </w:r>
+      <w:proofErr w:type="spellEnd"/>
+      <w:r>
+        <w:t xml:space="preserve"> DATE,</w:t>
+      </w:r>
+    </w:p>
+    <w:p>
+      <w:r>
+        <w:t xml:space="preserve">    day INT,</w:t>
+      </w:r>
+    </w:p>
+    <w:p>
+      <w:r>
+        <w:t xml:space="preserve">    month INT,</w:t>
+      </w:r>
+    </w:p>
+    <w:p>
+      <w:r>
+        <w:t xml:space="preserve">    year INT</w:t>
+      </w:r>
+    </w:p>
+    <w:p>
+      <w:r>
+        <w:t>);</w:t>
+      </w:r>
+    </w:p>
+    <w:p>
+      <w:r>
+        <w:t xml:space="preserve"> Transaction Type</w:t>
+      </w:r>
+    </w:p>
+    <w:p>
+      <w:r>
+        <w:t xml:space="preserve">CREATE TABLE </w:t>
+      </w:r>
+      <w:proofErr w:type="spellStart"/>
+      <w:r>
+        <w:t>dim_transaction_type</w:t>
+      </w:r>
+      <w:proofErr w:type="spellEnd"/>
+      <w:r>
+        <w:t xml:space="preserve"> (</w:t>
+      </w:r>
+    </w:p>
+    <w:p>
+      <w:r>
+        <w:t xml:space="preserve">    </w:t>
+      </w:r>
+      <w:proofErr w:type="spellStart"/>
+      <w:r>
+        <w:t>transaction_type_id</w:t>
+      </w:r>
+      <w:proofErr w:type="spellEnd"/>
+      <w:r>
+        <w:t xml:space="preserve"> INT PRIMARY KEY,</w:t>
+      </w:r>
+    </w:p>
+    <w:p>
+      <w:r>
+        <w:t xml:space="preserve">    </w:t>
+      </w:r>
+      <w:proofErr w:type="spellStart"/>
+      <w:r>
+        <w:t>type_name</w:t>
+      </w:r>
+      <w:proofErr w:type="spellEnd"/>
+      <w:r>
+        <w:t xml:space="preserve"> VARCHAR(50)</w:t>
+      </w:r>
+    </w:p>
+    <w:p>
+      <w:r>
+        <w:t>);</w:t>
+      </w:r>
+    </w:p>
+    <w:p>
+      <w:r>
+        <w:t xml:space="preserve"> Channel (ATM / Online / UPI)</w:t>
+      </w:r>
+    </w:p>
+    <w:p>
+      <w:r>
+        <w:t xml:space="preserve">CREATE TABLE </w:t>
+      </w:r>
+      <w:proofErr w:type="spellStart"/>
+      <w:r>
+        <w:t>dim_channel</w:t>
+      </w:r>
+      <w:proofErr w:type="spellEnd"/>
+      <w:r>
+        <w:t xml:space="preserve"> (</w:t>
+      </w:r>
+    </w:p>
+    <w:p>
+      <w:r>
+        <w:t xml:space="preserve">    </w:t>
+      </w:r>
+      <w:proofErr w:type="spellStart"/>
+      <w:r>
+        <w:t>channel_id</w:t>
+      </w:r>
+      <w:proofErr w:type="spellEnd"/>
+      <w:r>
+        <w:t xml:space="preserve"> INT PRIMARY KEY,</w:t>
+      </w:r>
+    </w:p>
+    <w:p>
+      <w:r>
+        <w:t xml:space="preserve">    </w:t>
+      </w:r>
+      <w:proofErr w:type="spellStart"/>
+      <w:r>
+        <w:t>channel_name</w:t>
+      </w:r>
+      <w:proofErr w:type="spellEnd"/>
+      <w:r>
+        <w:t xml:space="preserve"> VARCHAR(50)</w:t>
+      </w:r>
+    </w:p>
+    <w:p>
+      <w:r>
+        <w:t>);</w:t>
+      </w:r>
+    </w:p>
+    <w:p>
+      <w:r>
+        <w:t xml:space="preserve"> Currency</w:t>
+      </w:r>
+    </w:p>
+    <w:p>
+      <w:r>
+        <w:t xml:space="preserve">CREATE TABLE </w:t>
+      </w:r>
+      <w:proofErr w:type="spellStart"/>
+      <w:r>
+        <w:t>dim_currency</w:t>
+      </w:r>
+      <w:proofErr w:type="spellEnd"/>
+      <w:r>
+        <w:t xml:space="preserve"> (</w:t>
+      </w:r>
+    </w:p>
+    <w:p>
+      <w:r>
+        <w:t xml:space="preserve">    </w:t>
+      </w:r>
+      <w:proofErr w:type="spellStart"/>
+      <w:r>
+        <w:t>currency_id</w:t>
+      </w:r>
+      <w:proofErr w:type="spellEnd"/>
+      <w:r>
+        <w:t xml:space="preserve"> INT PRIMARY KEY,</w:t>
+      </w:r>
+    </w:p>
+    <w:p>
+      <w:r>
+        <w:t xml:space="preserve">    </w:t>
+      </w:r>
+      <w:proofErr w:type="spellStart"/>
+      <w:r>
+        <w:t>currency_name</w:t>
+      </w:r>
+      <w:proofErr w:type="spellEnd"/>
+      <w:r>
+        <w:t xml:space="preserve"> VARCHAR(50)</w:t>
+      </w:r>
+    </w:p>
+    <w:p>
+      <w:r>
+        <w:t>);</w:t>
+      </w:r>
+    </w:p>
+    <w:p>
+      <w:r>
+        <w:lastRenderedPageBreak/>
+        <w:t xml:space="preserve"> Employee (Optional for branch analysis)</w:t>
+      </w:r>
+    </w:p>
+    <w:p>
+      <w:r>
+        <w:t xml:space="preserve">CREATE TABLE </w:t>
+      </w:r>
+      <w:proofErr w:type="spellStart"/>
+      <w:r>
+        <w:t>dim_employee</w:t>
+      </w:r>
+      <w:proofErr w:type="spellEnd"/>
+      <w:r>
+        <w:t xml:space="preserve"> (</w:t>
+      </w:r>
+    </w:p>
+    <w:p>
+      <w:r>
+        <w:t xml:space="preserve">    </w:t>
+      </w:r>
+      <w:proofErr w:type="spellStart"/>
+      <w:r>
+        <w:t>employee_id</w:t>
+      </w:r>
+      <w:proofErr w:type="spellEnd"/>
+      <w:r>
+        <w:t xml:space="preserve"> INT PRIMARY KEY,</w:t>
+      </w:r>
+    </w:p>
+    <w:p>
+      <w:r>
+        <w:t xml:space="preserve">    </w:t>
+      </w:r>
+      <w:proofErr w:type="spellStart"/>
+      <w:r>
+        <w:t>employee_name</w:t>
+      </w:r>
+      <w:proofErr w:type="spellEnd"/>
+      <w:r>
+        <w:t xml:space="preserve"> VARCHAR(100),</w:t>
+      </w:r>
+    </w:p>
+    <w:p>
+      <w:r>
+        <w:t xml:space="preserve">    role VARCHAR(50)</w:t>
+      </w:r>
+    </w:p>
+    <w:p>
+      <w:r>
+        <w:t>);</w:t>
+      </w:r>
+    </w:p>
+    <w:p>
+      <w:r>
+        <w:t xml:space="preserve"> Region</w:t>
+      </w:r>
+    </w:p>
+    <w:p>
+      <w:r>
+        <w:t xml:space="preserve">CREATE TABLE </w:t>
+      </w:r>
+      <w:proofErr w:type="spellStart"/>
+      <w:r>
+        <w:t>dim_region</w:t>
+      </w:r>
+      <w:proofErr w:type="spellEnd"/>
+      <w:r>
+        <w:t xml:space="preserve"> (</w:t>
+      </w:r>
+    </w:p>
+    <w:p>
+      <w:r>
+        <w:t xml:space="preserve">    </w:t>
+      </w:r>
+      <w:proofErr w:type="spellStart"/>
+      <w:r>
+        <w:t>region_id</w:t>
+      </w:r>
+      <w:proofErr w:type="spellEnd"/>
+      <w:r>
+        <w:t xml:space="preserve"> INT PRIMARY KEY,</w:t>
+      </w:r>
+    </w:p>
+    <w:p>
+      <w:r>
+        <w:t xml:space="preserve">    </w:t>
+      </w:r>
+      <w:proofErr w:type="spellStart"/>
+      <w:r>
+        <w:t>region_name</w:t>
+      </w:r>
+      <w:proofErr w:type="spellEnd"/>
+      <w:r>
+        <w:t xml:space="preserve"> VARCHAR(50)</w:t>
+      </w:r>
+    </w:p>
+    <w:p>
+      <w:r>
+        <w:t>);</w:t>
+      </w:r>
+    </w:p>
+    <w:p>
+      <w:r>
+        <w:t xml:space="preserve"> Total Tables</w:t>
+      </w:r>
+    </w:p>
+    <w:p/>
+    <w:p>
+      <w:r>
+        <w:t xml:space="preserve"> 1 Fact + 9 Dimensions = 10 Tables</w:t>
+      </w:r>
+    </w:p>
+    <w:p/>
+    <w:p/>
+    <w:p>
+      <w:r>
+        <w:t xml:space="preserve"> SNOWFLAKE SCHEMA (Same System, Normalized)</w:t>
+      </w:r>
+    </w:p>
+    <w:p/>
+    <w:p>
+      <w:r>
+        <w:t>Now we break dimension tables into smaller tables</w:t>
+      </w:r>
+    </w:p>
+    <w:p/>
+    <w:p>
+      <w:r>
+        <w:t xml:space="preserve"> 1. Normalize Location</w:t>
+      </w:r>
+    </w:p>
+    <w:p>
+      <w:r>
+        <w:t xml:space="preserve">CREATE TABLE </w:t>
+      </w:r>
+      <w:proofErr w:type="spellStart"/>
+      <w:r>
+        <w:t>dim_country</w:t>
+      </w:r>
+      <w:proofErr w:type="spellEnd"/>
+      <w:r>
+        <w:t xml:space="preserve"> (</w:t>
+      </w:r>
+    </w:p>
+    <w:p>
+      <w:r>
+        <w:t xml:space="preserve">    </w:t>
+      </w:r>
+      <w:proofErr w:type="spellStart"/>
+      <w:r>
+        <w:t>country_id</w:t>
+      </w:r>
+      <w:proofErr w:type="spellEnd"/>
+      <w:r>
+        <w:t xml:space="preserve"> INT PRIMARY KEY,</w:t>
+      </w:r>
+    </w:p>
+    <w:p>
+      <w:r>
+        <w:t xml:space="preserve">    </w:t>
+      </w:r>
+      <w:proofErr w:type="spellStart"/>
+      <w:r>
+        <w:t>country_name</w:t>
+      </w:r>
+      <w:proofErr w:type="spellEnd"/>
+      <w:r>
+        <w:t xml:space="preserve"> VARCHAR(50)</w:t>
+      </w:r>
+    </w:p>
+    <w:p>
+      <w:r>
+        <w:t>);</w:t>
+      </w:r>
+    </w:p>
+    <w:p/>
+    <w:p>
+      <w:r>
+        <w:lastRenderedPageBreak/>
+        <w:t xml:space="preserve">CREATE TABLE </w:t>
+      </w:r>
+      <w:proofErr w:type="spellStart"/>
+      <w:r>
+        <w:t>dim_state</w:t>
+      </w:r>
+      <w:proofErr w:type="spellEnd"/>
+      <w:r>
+        <w:t xml:space="preserve"> (</w:t>
+      </w:r>
+    </w:p>
+    <w:p>
+      <w:r>
+        <w:t xml:space="preserve">    </w:t>
+      </w:r>
+      <w:proofErr w:type="spellStart"/>
+      <w:r>
+        <w:t>state_id</w:t>
+      </w:r>
+      <w:proofErr w:type="spellEnd"/>
+      <w:r>
+        <w:t xml:space="preserve"> INT PRIMARY KEY,</w:t>
+      </w:r>
+    </w:p>
+    <w:p>
+      <w:r>
+        <w:t xml:space="preserve">    </w:t>
+      </w:r>
+      <w:proofErr w:type="spellStart"/>
+      <w:r>
+        <w:t>state_name</w:t>
+      </w:r>
+      <w:proofErr w:type="spellEnd"/>
+      <w:r>
+        <w:t xml:space="preserve"> VARCHAR(50),</w:t>
+      </w:r>
+    </w:p>
+    <w:p>
+      <w:r>
+        <w:t xml:space="preserve">    </w:t>
+      </w:r>
+      <w:proofErr w:type="spellStart"/>
+      <w:r>
+        <w:t>country_id</w:t>
+      </w:r>
+      <w:proofErr w:type="spellEnd"/>
+      <w:r>
+        <w:t xml:space="preserve"> INT</w:t>
+      </w:r>
+    </w:p>
+    <w:p>
+      <w:r>
+        <w:t>);</w:t>
+      </w:r>
+    </w:p>
+    <w:p/>
+    <w:p>
+      <w:r>
+        <w:t xml:space="preserve">CREATE TABLE </w:t>
+      </w:r>
+      <w:proofErr w:type="spellStart"/>
+      <w:r>
+        <w:t>dim_city</w:t>
+      </w:r>
+      <w:proofErr w:type="spellEnd"/>
+      <w:r>
+        <w:t xml:space="preserve"> (</w:t>
+      </w:r>
+    </w:p>
+    <w:p>
+      <w:r>
+        <w:t xml:space="preserve">    </w:t>
+      </w:r>
+      <w:proofErr w:type="spellStart"/>
+      <w:r>
+        <w:t>city_id</w:t>
+      </w:r>
+      <w:proofErr w:type="spellEnd"/>
+      <w:r>
+        <w:t xml:space="preserve"> INT PRIMARY KEY,</w:t>
+      </w:r>
+    </w:p>
+    <w:p>
+      <w:r>
+        <w:t xml:space="preserve">    </w:t>
+      </w:r>
+      <w:proofErr w:type="spellStart"/>
+      <w:r>
+        <w:t>city_name</w:t>
+      </w:r>
+      <w:proofErr w:type="spellEnd"/>
+      <w:r>
+        <w:t xml:space="preserve"> VARCHAR(50),</w:t>
+      </w:r>
+    </w:p>
+    <w:p>
+      <w:r>
+        <w:t xml:space="preserve">    </w:t>
+      </w:r>
+      <w:proofErr w:type="spellStart"/>
+      <w:r>
+        <w:t>state_id</w:t>
+      </w:r>
+      <w:proofErr w:type="spellEnd"/>
+      <w:r>
+        <w:t xml:space="preserve"> INT</w:t>
+      </w:r>
+    </w:p>
+    <w:p>
+      <w:r>
+        <w:t>);</w:t>
+      </w:r>
+    </w:p>
+    <w:p>
+      <w:r>
+        <w:rPr>
+          <w:rFonts w:ascii="Segoe UI Emoji" w:hAnsi="Segoe UI Emoji" w:cs="Segoe UI Emoji"/>
+        </w:rPr>
+        <w:t>🔹</w:t>
+      </w:r>
+      <w:r>
+        <w:t xml:space="preserve"> 2. Updated Customer Table</w:t>
+      </w:r>
+    </w:p>
+    <w:p>
+      <w:r>
+        <w:t xml:space="preserve">CREATE TABLE </w:t>
+      </w:r>
+      <w:proofErr w:type="spellStart"/>
+      <w:r>
+        <w:t>dim_customer_sf</w:t>
+      </w:r>
+      <w:proofErr w:type="spellEnd"/>
+      <w:r>
+        <w:t xml:space="preserve"> (</w:t>
+      </w:r>
+    </w:p>
+    <w:p>
+      <w:r>
+        <w:t xml:space="preserve">    </w:t>
+      </w:r>
+      <w:proofErr w:type="spellStart"/>
+      <w:r>
+        <w:t>customer_id</w:t>
+      </w:r>
+      <w:proofErr w:type="spellEnd"/>
+      <w:r>
+        <w:t xml:space="preserve"> INT PRIMARY KEY,</w:t>
+      </w:r>
+    </w:p>
+    <w:p>
+      <w:r>
+        <w:t xml:space="preserve">    </w:t>
+      </w:r>
+      <w:proofErr w:type="spellStart"/>
+      <w:r>
+        <w:t>customer_name</w:t>
+      </w:r>
+      <w:proofErr w:type="spellEnd"/>
+      <w:r>
+        <w:t xml:space="preserve"> VARCHAR(100),</w:t>
+      </w:r>
+    </w:p>
+    <w:p>
+      <w:r>
+        <w:t xml:space="preserve">    </w:t>
+      </w:r>
+      <w:proofErr w:type="spellStart"/>
+      <w:r>
+        <w:t>city_id</w:t>
+      </w:r>
+      <w:proofErr w:type="spellEnd"/>
+      <w:r>
+        <w:t xml:space="preserve"> INT</w:t>
+      </w:r>
+    </w:p>
+    <w:p>
+      <w:r>
+        <w:t>);</w:t>
+      </w:r>
+    </w:p>
+    <w:p>
+      <w:r>
+        <w:rPr>
+          <w:rFonts w:ascii="Segoe UI Emoji" w:hAnsi="Segoe UI Emoji" w:cs="Segoe UI Emoji"/>
+        </w:rPr>
+        <w:t>🔹</w:t>
+      </w:r>
+      <w:r>
+        <w:t xml:space="preserve"> 3. Updated Branch Table</w:t>
+      </w:r>
+    </w:p>
+    <w:p>
+      <w:r>
+        <w:t xml:space="preserve">CREATE TABLE </w:t>
+      </w:r>
+      <w:proofErr w:type="spellStart"/>
+      <w:r>
+        <w:t>dim_branch_sf</w:t>
+      </w:r>
+      <w:proofErr w:type="spellEnd"/>
+      <w:r>
+        <w:t xml:space="preserve"> (</w:t>
+      </w:r>
+    </w:p>
+    <w:p>
+      <w:r>
+        <w:t xml:space="preserve">    </w:t>
+      </w:r>
+      <w:proofErr w:type="spellStart"/>
+      <w:r>
+        <w:t>branch_id</w:t>
+      </w:r>
+      <w:proofErr w:type="spellEnd"/>
+      <w:r>
+        <w:t xml:space="preserve"> INT PRIMARY KEY,</w:t>
+      </w:r>
+    </w:p>
+    <w:p>
+      <w:r>
+        <w:t xml:space="preserve">    </w:t>
+      </w:r>
+      <w:proofErr w:type="spellStart"/>
+      <w:r>
+        <w:t>branch_name</w:t>
+      </w:r>
+      <w:proofErr w:type="spellEnd"/>
+      <w:r>
+        <w:t xml:space="preserve"> VARCHAR(100),</w:t>
+      </w:r>
+    </w:p>
+    <w:p>
+      <w:r>
+        <w:t xml:space="preserve">    </w:t>
+      </w:r>
+      <w:proofErr w:type="spellStart"/>
+      <w:r>
+        <w:t>city_id</w:t>
+      </w:r>
+      <w:proofErr w:type="spellEnd"/>
+      <w:r>
+        <w:t xml:space="preserve"> INT</w:t>
+      </w:r>
+    </w:p>
+    <w:p>
+      <w:r>
+        <w:t>);</w:t>
+      </w:r>
+    </w:p>
+    <w:p>
+      <w:r>
+        <w:rPr>
+          <w:rFonts w:ascii="Segoe UI Emoji" w:hAnsi="Segoe UI Emoji" w:cs="Segoe UI Emoji"/>
+        </w:rPr>
+        <w:t>🔹</w:t>
+      </w:r>
+      <w:r>
+        <w:t xml:space="preserve"> 4. Normalize Account Type</w:t>
+      </w:r>
+    </w:p>
+    <w:p>
+      <w:r>
+        <w:t xml:space="preserve">CREATE TABLE </w:t>
+      </w:r>
+      <w:proofErr w:type="spellStart"/>
+      <w:r>
+        <w:t>dim_account_type</w:t>
+      </w:r>
+      <w:proofErr w:type="spellEnd"/>
+      <w:r>
+        <w:t xml:space="preserve"> (</w:t>
+      </w:r>
+    </w:p>
+    <w:p>
+      <w:r>
+        <w:t xml:space="preserve">    </w:t>
+      </w:r>
+      <w:proofErr w:type="spellStart"/>
+      <w:r>
+        <w:t>account_type_id</w:t>
+      </w:r>
+      <w:proofErr w:type="spellEnd"/>
+      <w:r>
+        <w:t xml:space="preserve"> INT PRIMARY KEY,</w:t>
+      </w:r>
+    </w:p>
+    <w:p>
+      <w:r>
+        <w:lastRenderedPageBreak/>
+        <w:t xml:space="preserve">    </w:t>
+      </w:r>
+      <w:proofErr w:type="spellStart"/>
+      <w:r>
+        <w:t>account_type_name</w:t>
+      </w:r>
+      <w:proofErr w:type="spellEnd"/>
+      <w:r>
+        <w:t xml:space="preserve"> VARCHAR(50)</w:t>
+      </w:r>
+    </w:p>
+    <w:p>
+      <w:r>
+        <w:t>);</w:t>
+      </w:r>
+    </w:p>
+    <w:p/>
+    <w:p>
+      <w:r>
+        <w:t xml:space="preserve">CREATE TABLE </w:t>
+      </w:r>
+      <w:proofErr w:type="spellStart"/>
+      <w:r>
+        <w:t>dim_account_sf</w:t>
+      </w:r>
+      <w:proofErr w:type="spellEnd"/>
+      <w:r>
+        <w:t xml:space="preserve"> (</w:t>
+      </w:r>
+    </w:p>
+    <w:p>
+      <w:r>
+        <w:t xml:space="preserve">    </w:t>
+      </w:r>
+      <w:proofErr w:type="spellStart"/>
+      <w:r>
+        <w:t>account_id</w:t>
+      </w:r>
+      <w:proofErr w:type="spellEnd"/>
+      <w:r>
+        <w:t xml:space="preserve"> INT PRIMARY KEY,</w:t>
+      </w:r>
+    </w:p>
+    <w:p>
+      <w:r>
+        <w:t xml:space="preserve">    </w:t>
+      </w:r>
+      <w:proofErr w:type="spellStart"/>
+      <w:r>
+        <w:t>account_type_id</w:t>
+      </w:r>
+      <w:proofErr w:type="spellEnd"/>
+      <w:r>
+        <w:t xml:space="preserve"> INT,</w:t>
+      </w:r>
+    </w:p>
+    <w:p>
+      <w:r>
+        <w:t xml:space="preserve">    </w:t>
+      </w:r>
+      <w:proofErr w:type="spellStart"/>
+      <w:r>
+        <w:t>account_status</w:t>
+      </w:r>
+      <w:proofErr w:type="spellEnd"/>
+      <w:r>
+        <w:t xml:space="preserve"> VARCHAR(20)</w:t>
+      </w:r>
+    </w:p>
+    <w:p>
+      <w:r>
+        <w:t>);</w:t>
+      </w:r>
+    </w:p>
+    <w:p>
+      <w:r>
+        <w:t xml:space="preserve"> 5. Normalize Transaction Type</w:t>
+      </w:r>
+    </w:p>
+    <w:p>
+      <w:r>
+        <w:t xml:space="preserve">CREATE TABLE </w:t>
+      </w:r>
+      <w:proofErr w:type="spellStart"/>
+      <w:r>
+        <w:t>dim_transaction_category</w:t>
+      </w:r>
+      <w:proofErr w:type="spellEnd"/>
+      <w:r>
+        <w:t xml:space="preserve"> (</w:t>
+      </w:r>
+    </w:p>
+    <w:p>
+      <w:r>
+        <w:t xml:space="preserve">    </w:t>
+      </w:r>
+      <w:proofErr w:type="spellStart"/>
+      <w:r>
+        <w:t>category_id</w:t>
+      </w:r>
+      <w:proofErr w:type="spellEnd"/>
+      <w:r>
+        <w:t xml:space="preserve"> INT PRIMARY KEY,</w:t>
+      </w:r>
+    </w:p>
+    <w:p>
+      <w:r>
+        <w:t xml:space="preserve">    </w:t>
+      </w:r>
+      <w:proofErr w:type="spellStart"/>
+      <w:r>
+        <w:t>category_name</w:t>
+      </w:r>
+      <w:proofErr w:type="spellEnd"/>
+      <w:r>
+        <w:t xml:space="preserve"> VARCHAR(50)</w:t>
+      </w:r>
+    </w:p>
+    <w:p>
+      <w:r>
+        <w:t>);</w:t>
+      </w:r>
+    </w:p>
+    <w:p/>
+    <w:p>
+      <w:r>
+        <w:t xml:space="preserve">CREATE TABLE </w:t>
+      </w:r>
+      <w:proofErr w:type="spellStart"/>
+      <w:r>
+        <w:t>dim_transaction_type_sf</w:t>
+      </w:r>
+      <w:proofErr w:type="spellEnd"/>
+      <w:r>
+        <w:t xml:space="preserve"> (</w:t>
+      </w:r>
+    </w:p>
+    <w:p>
+      <w:r>
+        <w:t xml:space="preserve">    </w:t>
+      </w:r>
+      <w:proofErr w:type="spellStart"/>
+      <w:r>
+        <w:t>transaction_type_id</w:t>
+      </w:r>
+      <w:proofErr w:type="spellEnd"/>
+      <w:r>
+        <w:t xml:space="preserve"> INT PRIMARY KEY,</w:t>
+      </w:r>
+    </w:p>
+    <w:p>
+      <w:r>
+        <w:t xml:space="preserve">    </w:t>
+      </w:r>
+      <w:proofErr w:type="spellStart"/>
+      <w:r>
+        <w:t>type_name</w:t>
+      </w:r>
+      <w:proofErr w:type="spellEnd"/>
+      <w:r>
+        <w:t xml:space="preserve"> VARCHAR(50),</w:t>
+      </w:r>
+    </w:p>
+    <w:p>
+      <w:r>
+        <w:t xml:space="preserve">    </w:t>
+      </w:r>
+      <w:proofErr w:type="spellStart"/>
+      <w:r>
+        <w:t>category_id</w:t>
+      </w:r>
+      <w:proofErr w:type="spellEnd"/>
+      <w:r>
+        <w:t xml:space="preserve"> INT</w:t>
+      </w:r>
+    </w:p>
+    <w:p>
+      <w:r>
+        <w:t>);</w:t>
+      </w:r>
+    </w:p>
     <w:sectPr>
       <w:pgSz w:w="12240" w:h="15840"/>
       <w:pgMar w:top="1440" w:right="1440" w:bottom="1440" w:left="1440" w:header="720" w:footer="720" w:gutter="0"/>
@@ -5376,6 +6606,155 @@
     </w:lvl>
   </w:abstractNum>
   <w:abstractNum w:abstractNumId="9" w15:restartNumberingAfterBreak="0">
+    <w:nsid w:val="3B60094C"/>
+    <w:multiLevelType w:val="multilevel"/>
+    <w:tmpl w:val="99FCC194"/>
+    <w:lvl w:ilvl="0">
+      <w:start w:val="1"/>
+      <w:numFmt w:val="bullet"/>
+      <w:lvlText w:val=""/>
+      <w:lvlJc w:val="left"/>
+      <w:pPr>
+        <w:tabs>
+          <w:tab w:val="num" w:pos="720"/>
+        </w:tabs>
+        <w:ind w:left="720" w:hanging="360"/>
+      </w:pPr>
+      <w:rPr>
+        <w:rFonts w:ascii="Symbol" w:hAnsi="Symbol" w:hint="default"/>
+        <w:sz w:val="20"/>
+      </w:rPr>
+    </w:lvl>
+    <w:lvl w:ilvl="1" w:tentative="1">
+      <w:start w:val="1"/>
+      <w:numFmt w:val="bullet"/>
+      <w:lvlText w:val="o"/>
+      <w:lvlJc w:val="left"/>
+      <w:pPr>
+        <w:tabs>
+          <w:tab w:val="num" w:pos="1440"/>
+        </w:tabs>
+        <w:ind w:left="1440" w:hanging="360"/>
+      </w:pPr>
+      <w:rPr>
+        <w:rFonts w:ascii="Courier New" w:hAnsi="Courier New" w:hint="default"/>
+        <w:sz w:val="20"/>
+      </w:rPr>
+    </w:lvl>
+    <w:lvl w:ilvl="2" w:tentative="1">
+      <w:start w:val="1"/>
+      <w:numFmt w:val="bullet"/>
+      <w:lvlText w:val=""/>
+      <w:lvlJc w:val="left"/>
+      <w:pPr>
+        <w:tabs>
+          <w:tab w:val="num" w:pos="2160"/>
+        </w:tabs>
+        <w:ind w:left="2160" w:hanging="360"/>
+      </w:pPr>
+      <w:rPr>
+        <w:rFonts w:ascii="Wingdings" w:hAnsi="Wingdings" w:hint="default"/>
+        <w:sz w:val="20"/>
+      </w:rPr>
+    </w:lvl>
+    <w:lvl w:ilvl="3" w:tentative="1">
+      <w:start w:val="1"/>
+      <w:numFmt w:val="bullet"/>
+      <w:lvlText w:val=""/>
+      <w:lvlJc w:val="left"/>
+      <w:pPr>
+        <w:tabs>
+          <w:tab w:val="num" w:pos="2880"/>
+        </w:tabs>
+        <w:ind w:left="2880" w:hanging="360"/>
+      </w:pPr>
+      <w:rPr>
+        <w:rFonts w:ascii="Wingdings" w:hAnsi="Wingdings" w:hint="default"/>
+        <w:sz w:val="20"/>
+      </w:rPr>
+    </w:lvl>
+    <w:lvl w:ilvl="4" w:tentative="1">
+      <w:start w:val="1"/>
+      <w:numFmt w:val="bullet"/>
+      <w:lvlText w:val=""/>
+      <w:lvlJc w:val="left"/>
+      <w:pPr>
+        <w:tabs>
+          <w:tab w:val="num" w:pos="3600"/>
+        </w:tabs>
+        <w:ind w:left="3600" w:hanging="360"/>
+      </w:pPr>
+      <w:rPr>
+        <w:rFonts w:ascii="Wingdings" w:hAnsi="Wingdings" w:hint="default"/>
+        <w:sz w:val="20"/>
+      </w:rPr>
+    </w:lvl>
+    <w:lvl w:ilvl="5" w:tentative="1">
+      <w:start w:val="1"/>
+      <w:numFmt w:val="bullet"/>
+      <w:lvlText w:val=""/>
+      <w:lvlJc w:val="left"/>
+      <w:pPr>
+        <w:tabs>
+          <w:tab w:val="num" w:pos="4320"/>
+        </w:tabs>
+        <w:ind w:left="4320" w:hanging="360"/>
+      </w:pPr>
+      <w:rPr>
+        <w:rFonts w:ascii="Wingdings" w:hAnsi="Wingdings" w:hint="default"/>
+        <w:sz w:val="20"/>
+      </w:rPr>
+    </w:lvl>
+    <w:lvl w:ilvl="6" w:tentative="1">
+      <w:start w:val="1"/>
+      <w:numFmt w:val="bullet"/>
+      <w:lvlText w:val=""/>
+      <w:lvlJc w:val="left"/>
+      <w:pPr>
+        <w:tabs>
+          <w:tab w:val="num" w:pos="5040"/>
+        </w:tabs>
+        <w:ind w:left="5040" w:hanging="360"/>
+      </w:pPr>
+      <w:rPr>
+        <w:rFonts w:ascii="Wingdings" w:hAnsi="Wingdings" w:hint="default"/>
+        <w:sz w:val="20"/>
+      </w:rPr>
+    </w:lvl>
+    <w:lvl w:ilvl="7" w:tentative="1">
+      <w:start w:val="1"/>
+      <w:numFmt w:val="bullet"/>
+      <w:lvlText w:val=""/>
+      <w:lvlJc w:val="left"/>
+      <w:pPr>
+        <w:tabs>
+          <w:tab w:val="num" w:pos="5760"/>
+        </w:tabs>
+        <w:ind w:left="5760" w:hanging="360"/>
+      </w:pPr>
+      <w:rPr>
+        <w:rFonts w:ascii="Wingdings" w:hAnsi="Wingdings" w:hint="default"/>
+        <w:sz w:val="20"/>
+      </w:rPr>
+    </w:lvl>
+    <w:lvl w:ilvl="8" w:tentative="1">
+      <w:start w:val="1"/>
+      <w:numFmt w:val="bullet"/>
+      <w:lvlText w:val=""/>
+      <w:lvlJc w:val="left"/>
+      <w:pPr>
+        <w:tabs>
+          <w:tab w:val="num" w:pos="6480"/>
+        </w:tabs>
+        <w:ind w:left="6480" w:hanging="360"/>
+      </w:pPr>
+      <w:rPr>
+        <w:rFonts w:ascii="Wingdings" w:hAnsi="Wingdings" w:hint="default"/>
+        <w:sz w:val="20"/>
+      </w:rPr>
+    </w:lvl>
+  </w:abstractNum>
+  <w:abstractNum w:abstractNumId="10" w15:restartNumberingAfterBreak="0">
     <w:nsid w:val="3B65456E"/>
     <w:multiLevelType w:val="multilevel"/>
     <w:tmpl w:val="7F405A9A"/>
@@ -5524,7 +6903,7 @@
       </w:rPr>
     </w:lvl>
   </w:abstractNum>
-  <w:abstractNum w:abstractNumId="10" w15:restartNumberingAfterBreak="0">
+  <w:abstractNum w:abstractNumId="11" w15:restartNumberingAfterBreak="0">
     <w:nsid w:val="41FC1FE3"/>
     <w:multiLevelType w:val="multilevel"/>
     <w:tmpl w:val="051C46B0"/>
@@ -5673,7 +7052,7 @@
       </w:rPr>
     </w:lvl>
   </w:abstractNum>
-  <w:abstractNum w:abstractNumId="11" w15:restartNumberingAfterBreak="0">
+  <w:abstractNum w:abstractNumId="12" w15:restartNumberingAfterBreak="0">
     <w:nsid w:val="441362A9"/>
     <w:multiLevelType w:val="multilevel"/>
     <w:tmpl w:val="5C0006F4"/>
@@ -5822,7 +7201,7 @@
       </w:rPr>
     </w:lvl>
   </w:abstractNum>
-  <w:abstractNum w:abstractNumId="12" w15:restartNumberingAfterBreak="0">
+  <w:abstractNum w:abstractNumId="13" w15:restartNumberingAfterBreak="0">
     <w:nsid w:val="447452A7"/>
     <w:multiLevelType w:val="multilevel"/>
     <w:tmpl w:val="43463594"/>
@@ -5971,7 +7350,7 @@
       </w:rPr>
     </w:lvl>
   </w:abstractNum>
-  <w:abstractNum w:abstractNumId="13" w15:restartNumberingAfterBreak="0">
+  <w:abstractNum w:abstractNumId="14" w15:restartNumberingAfterBreak="0">
     <w:nsid w:val="47BB103A"/>
     <w:multiLevelType w:val="multilevel"/>
     <w:tmpl w:val="76087238"/>
@@ -6120,7 +7499,7 @@
       </w:rPr>
     </w:lvl>
   </w:abstractNum>
-  <w:abstractNum w:abstractNumId="14" w15:restartNumberingAfterBreak="0">
+  <w:abstractNum w:abstractNumId="15" w15:restartNumberingAfterBreak="0">
     <w:nsid w:val="4AD1060A"/>
     <w:multiLevelType w:val="multilevel"/>
     <w:tmpl w:val="B9B846D4"/>
@@ -6269,7 +7648,7 @@
       </w:rPr>
     </w:lvl>
   </w:abstractNum>
-  <w:abstractNum w:abstractNumId="15" w15:restartNumberingAfterBreak="0">
+  <w:abstractNum w:abstractNumId="16" w15:restartNumberingAfterBreak="0">
     <w:nsid w:val="51986885"/>
     <w:multiLevelType w:val="multilevel"/>
     <w:tmpl w:val="15D28DEC"/>
@@ -6418,7 +7797,7 @@
       </w:rPr>
     </w:lvl>
   </w:abstractNum>
-  <w:abstractNum w:abstractNumId="16" w15:restartNumberingAfterBreak="0">
+  <w:abstractNum w:abstractNumId="17" w15:restartNumberingAfterBreak="0">
     <w:nsid w:val="52A96362"/>
     <w:multiLevelType w:val="multilevel"/>
     <w:tmpl w:val="EB142532"/>
@@ -6567,7 +7946,7 @@
       </w:rPr>
     </w:lvl>
   </w:abstractNum>
-  <w:abstractNum w:abstractNumId="17" w15:restartNumberingAfterBreak="0">
+  <w:abstractNum w:abstractNumId="18" w15:restartNumberingAfterBreak="0">
     <w:nsid w:val="578B40EB"/>
     <w:multiLevelType w:val="multilevel"/>
     <w:tmpl w:val="7F9E4EC4"/>
@@ -6720,13 +8099,13 @@
     <w:abstractNumId w:val="7"/>
   </w:num>
   <w:num w:numId="2" w16cid:durableId="2133552870">
+    <w:abstractNumId w:val="12"/>
+  </w:num>
+  <w:num w:numId="3" w16cid:durableId="563180956">
     <w:abstractNumId w:val="11"/>
   </w:num>
-  <w:num w:numId="3" w16cid:durableId="563180956">
-    <w:abstractNumId w:val="10"/>
-  </w:num>
   <w:num w:numId="4" w16cid:durableId="1773012578">
-    <w:abstractNumId w:val="12"/>
+    <w:abstractNumId w:val="13"/>
   </w:num>
   <w:num w:numId="5" w16cid:durableId="952901470">
     <w:abstractNumId w:val="3"/>
@@ -6735,7 +8114,7 @@
     <w:abstractNumId w:val="0"/>
   </w:num>
   <w:num w:numId="7" w16cid:durableId="676814398">
-    <w:abstractNumId w:val="13"/>
+    <w:abstractNumId w:val="14"/>
   </w:num>
   <w:num w:numId="8" w16cid:durableId="473647248">
     <w:abstractNumId w:val="8"/>
@@ -6747,28 +8126,31 @@
     <w:abstractNumId w:val="6"/>
   </w:num>
   <w:num w:numId="11" w16cid:durableId="323558330">
-    <w:abstractNumId w:val="17"/>
+    <w:abstractNumId w:val="18"/>
   </w:num>
   <w:num w:numId="12" w16cid:durableId="527571759">
-    <w:abstractNumId w:val="16"/>
+    <w:abstractNumId w:val="17"/>
   </w:num>
   <w:num w:numId="13" w16cid:durableId="285088491">
     <w:abstractNumId w:val="2"/>
   </w:num>
   <w:num w:numId="14" w16cid:durableId="419719657">
+    <w:abstractNumId w:val="16"/>
+  </w:num>
+  <w:num w:numId="15" w16cid:durableId="1658803099">
     <w:abstractNumId w:val="15"/>
   </w:num>
-  <w:num w:numId="15" w16cid:durableId="1658803099">
-    <w:abstractNumId w:val="14"/>
-  </w:num>
   <w:num w:numId="16" w16cid:durableId="501624692">
-    <w:abstractNumId w:val="9"/>
+    <w:abstractNumId w:val="10"/>
   </w:num>
   <w:num w:numId="17" w16cid:durableId="1060446096">
     <w:abstractNumId w:val="5"/>
   </w:num>
   <w:num w:numId="18" w16cid:durableId="389114977">
     <w:abstractNumId w:val="4"/>
+  </w:num>
+  <w:num w:numId="19" w16cid:durableId="2087680582">
+    <w:abstractNumId w:val="9"/>
   </w:num>
 </w:numbering>
 </file>
@@ -7376,7 +8758,6 @@
   <w:style w:type="character" w:default="1" w:styleId="DefaultParagraphFont">
     <w:name w:val="Default Paragraph Font"/>
     <w:uiPriority w:val="1"/>
-    <w:semiHidden/>
     <w:unhideWhenUsed/>
   </w:style>
   <w:style w:type="table" w:default="1" w:styleId="TableNormal">

</xml_diff>